<commit_message>
fix: add AHPCCA/Pharmacy Council verification route alongside Joint Commission PSV (HRM13)
5.2 relied solely on The Joint Commission's primary-source-verification
white paper for para-clinical credential checks. Added a note that the
Indian route runs through the Allied and Healthcare Professions Central
Council Act 2021 (or the Pharmacy Council of India Act 1948 for
pharmacists), alongside direct confirmation from the awarding institution.

Co-Authored-By: Claude Sonnet 5 <noreply@anthropic.com>
Claude-Session: https://claude.ai/code/session_01TPRLtLhmTCP5z94Q3FiE5v
</commit_message>
<xml_diff>
--- a/policies/build/chapters_v2/HRM/documents/HRM_Package_v2/HRM13/SOP_HRM13_credentialing_and_privileging_of_para_clinical_professionals.docx
+++ b/policies/build/chapters_v2/HRM/documents/HRM_Package_v2/HRM13/SOP_HRM13_credentialing_and_privileging_of_para_clinical_professionals.docx
@@ -321,34 +321,22 @@
     </w:p>
     <w:p>
       <w:r>
-        <w:t xml:space="preserve">HR In-Charge / Personnel Officer: </w:t>
-      </w:r>
-      <w:r>
-        <w:t>owns recruitment, training records, personal files and the day-to-day running of this policy, and keeps the required records current.</w:t>
+        <w:t xml:space="preserve">HR In-Charge / Personnel Officer: owns recruitment, training records, personal files and the day-to-day running of this policy, and keeps the required records current.</w:t>
       </w:r>
     </w:p>
     <w:p>
       <w:r>
-        <w:t xml:space="preserve">Medical Superintendent: </w:t>
-      </w:r>
-      <w:r>
-        <w:t>escalation point for any unresolved gap, and approves the workforce plan, contingency plan and credentialing/privileging decisions.</w:t>
+        <w:t xml:space="preserve">Medical Superintendent: escalation point for any unresolved gap, and approves the workforce plan, contingency plan and credentialing/privileging decisions.</w:t>
       </w:r>
     </w:p>
     <w:p>
       <w:r>
-        <w:t xml:space="preserve">Department Heads / Heads of Service: </w:t>
-      </w:r>
-      <w:r>
-        <w:t>identify their own department's staffing, training and credentialing needs, and support this policy's records at department level.</w:t>
+        <w:t xml:space="preserve">Department Heads / Heads of Service: identify their own department's staffing, training and credentialing needs, and support this policy's records at department level.</w:t>
       </w:r>
     </w:p>
     <w:p>
       <w:r>
-        <w:t xml:space="preserve">Quality Coordinator: </w:t>
-      </w:r>
-      <w:r>
-        <w:t>audits this policy periodically, checks records against the steps below, and flags gaps for corrective action.</w:t>
+        <w:t xml:space="preserve">Quality Coordinator: audits this policy periodically, checks records against the steps below, and flags gaps for corrective action.</w:t>
       </w:r>
     </w:p>
     <w:p>
@@ -480,6 +468,14 @@
           <w:t>The Joint Commission. Primary Source Verification (white paper).</w:t>
         </w:r>
       </w:hyperlink>
+    </w:p>
+    <w:p>
+      <w:pPr>
+        <w:pStyle w:val="ListParagraph"/>
+      </w:pPr>
+      <w:r>
+        <w:t>Note: The Joint Commission’s primary-source-verification concept is cited as a methodology reference, not as the verification route itself. In India, the operative primary-source check runs through the relevant statutory council — the Allied and Healthcare Professions Central Council Act, 2021 for most para-clinical professions, or the Pharmacy Council of India Act, 1948 for pharmacists — alongside direct confirmation from the awarding institution.</w:t>
+      </w:r>
     </w:p>
     <w:p>
       <w:pPr>

</xml_diff>